<commit_message>
Add Ambarella SDK8 Security Application Note as reference, with notes and source index entry
</commit_message>
<xml_diff>
--- a/CS-Testing/00-Analysis/03_Source_Index.docx
+++ b/CS-Testing/00-Analysis/03_Source_Index.docx
@@ -1785,6 +1785,59 @@
                 <w:sz w:val="17"/>
               </w:rPr>
               <w:t xml:space="preserve">Power; relevant to fault-injection tests</w:t>
+            </w:r>
+          </w:p>
+        </w:tc>
+      </w:tr>
+      <w:tr>
+        <w:tc>
+          <w:tcPr>
+            <w:tcW w:type="dxa" w:w="1955"/>
+          </w:tcPr>
+          <w:p>
+            <w:pPr>
+              <w:pStyle w:val="Compact"/>
+            </w:pPr>
+            <w:r/>
+            <w:r>
+              <w:rPr>
+                <w:sz w:val="17"/>
+              </w:rPr>
+              <w:t>Ambarella SDK8 Security Application Note (SDK8-AN-002)</w:t>
+            </w:r>
+          </w:p>
+        </w:tc>
+        <w:tc>
+          <w:tcPr>
+            <w:tcW w:type="dxa" w:w="4694"/>
+          </w:tcPr>
+          <w:p>
+            <w:pPr>
+              <w:pStyle w:val="Compact"/>
+            </w:pPr>
+            <w:r/>
+            <w:r>
+              <w:rPr>
+                <w:sz w:val="17"/>
+              </w:rPr>
+              <w:t>SoC (CV22FS)/SDK8-AN-002_2.2_Ambarella_SDK8_AN_Security.pdf (v2.2, rev. 991489, 2023-07-05)</w:t>
+            </w:r>
+          </w:p>
+        </w:tc>
+        <w:tc>
+          <w:tcPr>
+            <w:tcW w:type="dxa" w:w="3285"/>
+          </w:tcPr>
+          <w:p>
+            <w:pPr>
+              <w:pStyle w:val="Compact"/>
+            </w:pPr>
+            <w:r/>
+            <w:r>
+              <w:rPr>
+                <w:sz w:val="17"/>
+              </w:rPr>
+              <w:t>Root of trust, OTP layout and rules, JTAG and debug stages, TRNG, DRAM scrambling. Notes: 04_Ambarella_Security_AN_Notes.docx</w:t>
             </w:r>
           </w:p>
         </w:tc>

</xml_diff>